<commit_message>
v0.7.9.7.1: Scenario B MACD /patch support, param_helper updates, range smoke-test
</commit_message>
<xml_diff>
--- a/test features/test features.docx
+++ b/test features/test features.docx
@@ -111,31 +111,104 @@
     </w:p>
     <w:p/>
     <w:p>
-      <w:pPr>
-        <w:spacing w:before="100" w:beforeAutospacing="1" w:after="100" w:afterAutospacing="1" w:line="240" w:lineRule="auto"/>
-        <w:outlineLvl w:val="2"/>
-        <w:rPr>
-          <w:rFonts w:ascii="Times New Roman" w:eastAsia="Times New Roman" w:hAnsi="Times New Roman" w:cs="Times New Roman"/>
-          <w:b/>
-          <w:bCs/>
-          <w:kern w:val="0"/>
-          <w:sz w:val="27"/>
-          <w:szCs w:val="27"/>
-          <w14:ligatures w14:val="none"/>
-        </w:rPr>
-      </w:pPr>
-      <w:r>
-        <w:rPr>
-          <w:rFonts w:ascii="Times New Roman" w:eastAsia="Times New Roman" w:hAnsi="Times New Roman" w:cs="Times New Roman"/>
-          <w:b/>
-          <w:bCs/>
-          <w:kern w:val="0"/>
-          <w:sz w:val="27"/>
-          <w:szCs w:val="27"/>
-          <w14:ligatures w14:val="none"/>
-        </w:rPr>
-        <w:t>2. Start the UI</w:t>
-      </w:r>
+      <w:r>
+        <w:t>Should see</w:t>
+      </w:r>
+    </w:p>
+    <w:p>
+      <w:r>
+        <w:t xml:space="preserve">2025-11-24 08:36:44,880 INFO Starting </w:t>
+      </w:r>
+      <w:proofErr w:type="spellStart"/>
+      <w:r>
+        <w:t>param_helper</w:t>
+      </w:r>
+      <w:proofErr w:type="spellEnd"/>
+      <w:r>
+        <w:t xml:space="preserve"> on 127.0.0.1:5001</w:t>
+      </w:r>
+    </w:p>
+    <w:p>
+      <w:r>
+        <w:t xml:space="preserve"> * Serving Flask app '</w:t>
+      </w:r>
+      <w:proofErr w:type="spellStart"/>
+      <w:r>
+        <w:t>param_helper</w:t>
+      </w:r>
+      <w:proofErr w:type="spellEnd"/>
+      <w:r>
+        <w:t>'</w:t>
+      </w:r>
+    </w:p>
+    <w:p>
+      <w:r>
+        <w:t xml:space="preserve"> * Debug mode: off</w:t>
+      </w:r>
+    </w:p>
+    <w:p>
+      <w:pPr>
+        <w:rPr>
+          <w:color w:val="EE0000"/>
+        </w:rPr>
+      </w:pPr>
+      <w:r>
+        <w:rPr>
+          <w:color w:val="EE0000"/>
+        </w:rPr>
+        <w:t xml:space="preserve">WARNING: This is a development server. Do not use it in </w:t>
+      </w:r>
+      <w:proofErr w:type="gramStart"/>
+      <w:r>
+        <w:rPr>
+          <w:color w:val="EE0000"/>
+        </w:rPr>
+        <w:t>a production</w:t>
+      </w:r>
+      <w:proofErr w:type="gramEnd"/>
+      <w:r>
+        <w:rPr>
+          <w:color w:val="EE0000"/>
+        </w:rPr>
+        <w:t xml:space="preserve"> deployment. Use a production WSGI server instead.</w:t>
+      </w:r>
+    </w:p>
+    <w:p>
+      <w:r>
+        <w:t xml:space="preserve"> * Running on http://127.0.0.1:5001</w:t>
+      </w:r>
+    </w:p>
+    <w:p>
+      <w:pPr>
+        <w:rPr>
+          <w:color w:val="00B0F0"/>
+        </w:rPr>
+      </w:pPr>
+      <w:r>
+        <w:rPr>
+          <w:color w:val="00B0F0"/>
+        </w:rPr>
+        <w:t>Press CTRL+C to quit</w:t>
+      </w:r>
+    </w:p>
+    <w:p/>
+    <w:p>
+      <w:pPr>
+        <w:pStyle w:val="ListParagraph"/>
+        <w:numPr>
+          <w:ilvl w:val="1"/>
+          <w:numId w:val="3"/>
+        </w:numPr>
+      </w:pPr>
+      <w:r>
+        <w:t>in another directory</w:t>
+      </w:r>
+    </w:p>
+    <w:p>
+      <w:pPr>
+        <w:pStyle w:val="ListParagraph"/>
+        <w:ind w:left="375"/>
+      </w:pPr>
     </w:p>
     <w:p>
       <w:pPr>
@@ -174,7 +247,227 @@
           <w:szCs w:val="20"/>
           <w14:ligatures w14:val="none"/>
         </w:rPr>
-        <w:t>cd C:\Users\boydp\Desktop\midas-ui</w:t>
+        <w:t>cd C:\Users\boydp\Desktop\midas_V2_v0.4.7.9_working</w:t>
+      </w:r>
+    </w:p>
+    <w:p>
+      <w:pPr>
+        <w:pStyle w:val="ListParagraph"/>
+        <w:ind w:left="375"/>
+      </w:pPr>
+    </w:p>
+    <w:p>
+      <w:pPr>
+        <w:rPr>
+          <w:u w:val="single"/>
+        </w:rPr>
+      </w:pPr>
+      <w:r>
+        <w:rPr>
+          <w:u w:val="single"/>
+        </w:rPr>
+        <w:t>Example parameter before</w:t>
+      </w:r>
+    </w:p>
+    <w:p>
+      <w:r>
+        <w:t>Invoke-</w:t>
+      </w:r>
+      <w:proofErr w:type="spellStart"/>
+      <w:r>
+        <w:t>WebRequest</w:t>
+      </w:r>
+      <w:proofErr w:type="spellEnd"/>
+      <w:r>
+        <w:t xml:space="preserve"> "http://127.0.0.1:5001/</w:t>
+      </w:r>
+      <w:proofErr w:type="spellStart"/>
+      <w:r>
+        <w:t>patch?dry_run</w:t>
+      </w:r>
+      <w:proofErr w:type="spellEnd"/>
+      <w:r>
+        <w:t xml:space="preserve">=1&amp;scenario=B" -Method POST -Headers </w:t>
+      </w:r>
+      <w:proofErr w:type="gramStart"/>
+      <w:r>
+        <w:t>@{ "</w:t>
+      </w:r>
+      <w:proofErr w:type="gramEnd"/>
+      <w:r>
+        <w:t>Content-Type" = "application/</w:t>
+      </w:r>
+      <w:proofErr w:type="spellStart"/>
+      <w:r>
+        <w:t>json</w:t>
+      </w:r>
+      <w:proofErr w:type="spellEnd"/>
+      <w:proofErr w:type="gramStart"/>
+      <w:r>
+        <w:t>" }</w:t>
+      </w:r>
+      <w:proofErr w:type="gramEnd"/>
+      <w:r>
+        <w:t xml:space="preserve"> -Body </w:t>
+      </w:r>
+      <w:proofErr w:type="gramStart"/>
+      <w:r>
+        <w:t>'{ "</w:t>
+      </w:r>
+      <w:proofErr w:type="spellStart"/>
+      <w:proofErr w:type="gramEnd"/>
+      <w:r>
+        <w:t>require_macd_rise</w:t>
+      </w:r>
+      <w:proofErr w:type="spellEnd"/>
+      <w:r>
+        <w:t>": true, "</w:t>
+      </w:r>
+      <w:proofErr w:type="spellStart"/>
+      <w:r>
+        <w:t>macd_rise_bars</w:t>
+      </w:r>
+      <w:proofErr w:type="spellEnd"/>
+      <w:r>
+        <w:t xml:space="preserve">": </w:t>
+      </w:r>
+      <w:proofErr w:type="gramStart"/>
+      <w:r>
+        <w:t>2 }</w:t>
+      </w:r>
+      <w:proofErr w:type="gramEnd"/>
+      <w:r>
+        <w:t>'</w:t>
+      </w:r>
+    </w:p>
+    <w:p>
+      <w:pPr>
+        <w:rPr>
+          <w:u w:val="single"/>
+        </w:rPr>
+      </w:pPr>
+      <w:r>
+        <w:rPr>
+          <w:u w:val="single"/>
+        </w:rPr>
+        <w:t xml:space="preserve">Example parameter </w:t>
+      </w:r>
+      <w:r>
+        <w:rPr>
+          <w:u w:val="single"/>
+        </w:rPr>
+        <w:t>after</w:t>
+      </w:r>
+    </w:p>
+    <w:p>
+      <w:r>
+        <w:t>Invoke-</w:t>
+      </w:r>
+      <w:proofErr w:type="spellStart"/>
+      <w:r>
+        <w:t>WebRequest</w:t>
+      </w:r>
+      <w:proofErr w:type="spellEnd"/>
+      <w:r>
+        <w:t xml:space="preserve"> "http://127.0.0.1:5001/</w:t>
+      </w:r>
+      <w:proofErr w:type="spellStart"/>
+      <w:r>
+        <w:t>patch?apply</w:t>
+      </w:r>
+      <w:proofErr w:type="spellEnd"/>
+      <w:r>
+        <w:t xml:space="preserve">=1&amp;scenario=B" -Method POST -Headers </w:t>
+      </w:r>
+      <w:proofErr w:type="gramStart"/>
+      <w:r>
+        <w:t>@{ "</w:t>
+      </w:r>
+      <w:proofErr w:type="gramEnd"/>
+      <w:r>
+        <w:t>Content-Type" = "application/</w:t>
+      </w:r>
+      <w:proofErr w:type="spellStart"/>
+      <w:r>
+        <w:t>json</w:t>
+      </w:r>
+      <w:proofErr w:type="spellEnd"/>
+      <w:proofErr w:type="gramStart"/>
+      <w:r>
+        <w:t>" }</w:t>
+      </w:r>
+      <w:proofErr w:type="gramEnd"/>
+      <w:r>
+        <w:t xml:space="preserve"> -Body </w:t>
+      </w:r>
+      <w:proofErr w:type="gramStart"/>
+      <w:r>
+        <w:t>'{ "</w:t>
+      </w:r>
+      <w:proofErr w:type="spellStart"/>
+      <w:proofErr w:type="gramEnd"/>
+      <w:r>
+        <w:t>require_macd_rise</w:t>
+      </w:r>
+      <w:proofErr w:type="spellEnd"/>
+      <w:r>
+        <w:t>": true, "</w:t>
+      </w:r>
+      <w:proofErr w:type="spellStart"/>
+      <w:r>
+        <w:t>macd_rise_bars</w:t>
+      </w:r>
+      <w:proofErr w:type="spellEnd"/>
+      <w:r>
+        <w:t xml:space="preserve">": </w:t>
+      </w:r>
+      <w:proofErr w:type="gramStart"/>
+      <w:r>
+        <w:t>2 }</w:t>
+      </w:r>
+      <w:proofErr w:type="gramEnd"/>
+      <w:r>
+        <w:t>'</w:t>
+      </w:r>
+    </w:p>
+    <w:p/>
+    <w:p>
+      <w:pPr>
+        <w:spacing w:before="100" w:beforeAutospacing="1" w:after="100" w:afterAutospacing="1" w:line="240" w:lineRule="auto"/>
+        <w:outlineLvl w:val="2"/>
+        <w:rPr>
+          <w:rFonts w:ascii="Times New Roman" w:eastAsia="Times New Roman" w:hAnsi="Times New Roman" w:cs="Times New Roman"/>
+          <w:b/>
+          <w:bCs/>
+          <w:kern w:val="0"/>
+          <w:sz w:val="27"/>
+          <w:szCs w:val="27"/>
+          <w14:ligatures w14:val="none"/>
+        </w:rPr>
+      </w:pPr>
+      <w:r>
+        <w:rPr>
+          <w:rFonts w:ascii="Times New Roman" w:eastAsia="Times New Roman" w:hAnsi="Times New Roman" w:cs="Times New Roman"/>
+          <w:b/>
+          <w:bCs/>
+          <w:kern w:val="0"/>
+          <w:sz w:val="27"/>
+          <w:szCs w:val="27"/>
+          <w14:ligatures w14:val="none"/>
+        </w:rPr>
+        <w:t>2. Start the UI</w:t>
+      </w:r>
+      <w:r>
+        <w:rPr>
+          <w:rFonts w:ascii="Times New Roman" w:eastAsia="Times New Roman" w:hAnsi="Times New Roman" w:cs="Times New Roman"/>
+          <w:b/>
+          <w:bCs/>
+          <w:kern w:val="0"/>
+          <w:sz w:val="27"/>
+          <w:szCs w:val="27"/>
+          <w14:ligatures w14:val="none"/>
+        </w:rPr>
+        <w:t xml:space="preserve"> (note – only needed when testing the website)</w:t>
       </w:r>
     </w:p>
     <w:p>
@@ -206,7 +499,6 @@
           <w14:ligatures w14:val="none"/>
         </w:rPr>
       </w:pPr>
-      <w:proofErr w:type="spellStart"/>
       <w:r>
         <w:rPr>
           <w:rFonts w:ascii="Courier New" w:eastAsia="Times New Roman" w:hAnsi="Courier New" w:cs="Courier New"/>
@@ -215,10 +507,30 @@
           <w:szCs w:val="20"/>
           <w14:ligatures w14:val="none"/>
         </w:rPr>
-        <w:t>npm</w:t>
-      </w:r>
-      <w:proofErr w:type="spellEnd"/>
-      <w:r>
+        <w:t>cd C:\Users\boydp\Desktop\midas-ui</w:t>
+      </w:r>
+    </w:p>
+    <w:p>
+      <w:pPr>
+        <w:tabs>
+          <w:tab w:val="left" w:pos="916"/>
+          <w:tab w:val="left" w:pos="1832"/>
+          <w:tab w:val="left" w:pos="2748"/>
+          <w:tab w:val="left" w:pos="3664"/>
+          <w:tab w:val="left" w:pos="4580"/>
+          <w:tab w:val="left" w:pos="5496"/>
+          <w:tab w:val="left" w:pos="6412"/>
+          <w:tab w:val="left" w:pos="7328"/>
+          <w:tab w:val="left" w:pos="8244"/>
+          <w:tab w:val="left" w:pos="9160"/>
+          <w:tab w:val="left" w:pos="10076"/>
+          <w:tab w:val="left" w:pos="10992"/>
+          <w:tab w:val="left" w:pos="11908"/>
+          <w:tab w:val="left" w:pos="12824"/>
+          <w:tab w:val="left" w:pos="13740"/>
+          <w:tab w:val="left" w:pos="14656"/>
+        </w:tabs>
+        <w:spacing w:after="0" w:line="240" w:lineRule="auto"/>
         <w:rPr>
           <w:rFonts w:ascii="Courier New" w:eastAsia="Times New Roman" w:hAnsi="Courier New" w:cs="Courier New"/>
           <w:kern w:val="0"/>
@@ -226,6 +538,27 @@
           <w:szCs w:val="20"/>
           <w14:ligatures w14:val="none"/>
         </w:rPr>
+      </w:pPr>
+      <w:proofErr w:type="spellStart"/>
+      <w:r>
+        <w:rPr>
+          <w:rFonts w:ascii="Courier New" w:eastAsia="Times New Roman" w:hAnsi="Courier New" w:cs="Courier New"/>
+          <w:kern w:val="0"/>
+          <w:sz w:val="20"/>
+          <w:szCs w:val="20"/>
+          <w14:ligatures w14:val="none"/>
+        </w:rPr>
+        <w:t>npm</w:t>
+      </w:r>
+      <w:proofErr w:type="spellEnd"/>
+      <w:r>
+        <w:rPr>
+          <w:rFonts w:ascii="Courier New" w:eastAsia="Times New Roman" w:hAnsi="Courier New" w:cs="Courier New"/>
+          <w:kern w:val="0"/>
+          <w:sz w:val="20"/>
+          <w:szCs w:val="20"/>
+          <w14:ligatures w14:val="none"/>
+        </w:rPr>
         <w:t xml:space="preserve"> run dev</w:t>
       </w:r>
     </w:p>
@@ -245,6 +578,7 @@
           <w:kern w:val="0"/>
           <w14:ligatures w14:val="none"/>
         </w:rPr>
+        <w:lastRenderedPageBreak/>
         <w:t>Open browser:</w:t>
       </w:r>
     </w:p>
@@ -1041,6 +1375,119 @@
     </w:lvl>
   </w:abstractNum>
   <w:abstractNum w:abstractNumId="1" w15:restartNumberingAfterBreak="0">
+    <w:nsid w:val="1BB93CEE"/>
+    <w:multiLevelType w:val="multilevel"/>
+    <w:tmpl w:val="49D870F2"/>
+    <w:lvl w:ilvl="0">
+      <w:start w:val="1"/>
+      <w:numFmt w:val="decimal"/>
+      <w:lvlText w:val="%1"/>
+      <w:lvlJc w:val="left"/>
+      <w:pPr>
+        <w:ind w:left="375" w:hanging="375"/>
+      </w:pPr>
+      <w:rPr>
+        <w:rFonts w:hint="default"/>
+      </w:rPr>
+    </w:lvl>
+    <w:lvl w:ilvl="1">
+      <w:start w:val="1"/>
+      <w:numFmt w:val="decimal"/>
+      <w:lvlText w:val="%1.%2"/>
+      <w:lvlJc w:val="left"/>
+      <w:pPr>
+        <w:ind w:left="375" w:hanging="375"/>
+      </w:pPr>
+      <w:rPr>
+        <w:rFonts w:hint="default"/>
+      </w:rPr>
+    </w:lvl>
+    <w:lvl w:ilvl="2">
+      <w:start w:val="1"/>
+      <w:numFmt w:val="decimal"/>
+      <w:lvlText w:val="%1.%2.%3"/>
+      <w:lvlJc w:val="left"/>
+      <w:pPr>
+        <w:ind w:left="720" w:hanging="720"/>
+      </w:pPr>
+      <w:rPr>
+        <w:rFonts w:hint="default"/>
+      </w:rPr>
+    </w:lvl>
+    <w:lvl w:ilvl="3">
+      <w:start w:val="1"/>
+      <w:numFmt w:val="decimal"/>
+      <w:lvlText w:val="%1.%2.%3.%4"/>
+      <w:lvlJc w:val="left"/>
+      <w:pPr>
+        <w:ind w:left="1080" w:hanging="1080"/>
+      </w:pPr>
+      <w:rPr>
+        <w:rFonts w:hint="default"/>
+      </w:rPr>
+    </w:lvl>
+    <w:lvl w:ilvl="4">
+      <w:start w:val="1"/>
+      <w:numFmt w:val="decimal"/>
+      <w:lvlText w:val="%1.%2.%3.%4.%5"/>
+      <w:lvlJc w:val="left"/>
+      <w:pPr>
+        <w:ind w:left="1080" w:hanging="1080"/>
+      </w:pPr>
+      <w:rPr>
+        <w:rFonts w:hint="default"/>
+      </w:rPr>
+    </w:lvl>
+    <w:lvl w:ilvl="5">
+      <w:start w:val="1"/>
+      <w:numFmt w:val="decimal"/>
+      <w:lvlText w:val="%1.%2.%3.%4.%5.%6"/>
+      <w:lvlJc w:val="left"/>
+      <w:pPr>
+        <w:ind w:left="1440" w:hanging="1440"/>
+      </w:pPr>
+      <w:rPr>
+        <w:rFonts w:hint="default"/>
+      </w:rPr>
+    </w:lvl>
+    <w:lvl w:ilvl="6">
+      <w:start w:val="1"/>
+      <w:numFmt w:val="decimal"/>
+      <w:lvlText w:val="%1.%2.%3.%4.%5.%6.%7"/>
+      <w:lvlJc w:val="left"/>
+      <w:pPr>
+        <w:ind w:left="1440" w:hanging="1440"/>
+      </w:pPr>
+      <w:rPr>
+        <w:rFonts w:hint="default"/>
+      </w:rPr>
+    </w:lvl>
+    <w:lvl w:ilvl="7">
+      <w:start w:val="1"/>
+      <w:numFmt w:val="decimal"/>
+      <w:lvlText w:val="%1.%2.%3.%4.%5.%6.%7.%8"/>
+      <w:lvlJc w:val="left"/>
+      <w:pPr>
+        <w:ind w:left="1800" w:hanging="1800"/>
+      </w:pPr>
+      <w:rPr>
+        <w:rFonts w:hint="default"/>
+      </w:rPr>
+    </w:lvl>
+    <w:lvl w:ilvl="8">
+      <w:start w:val="1"/>
+      <w:numFmt w:val="decimal"/>
+      <w:lvlText w:val="%1.%2.%3.%4.%5.%6.%7.%8.%9"/>
+      <w:lvlJc w:val="left"/>
+      <w:pPr>
+        <w:ind w:left="1800" w:hanging="1800"/>
+      </w:pPr>
+      <w:rPr>
+        <w:rFonts w:hint="default"/>
+      </w:rPr>
+    </w:lvl>
+  </w:abstractNum>
+  <w:abstractNum w:abstractNumId="2" w15:restartNumberingAfterBreak="0">
     <w:nsid w:val="4DC42874"/>
     <w:multiLevelType w:val="multilevel"/>
     <w:tmpl w:val="4A4EE2E0"/>
@@ -1190,10 +1637,13 @@
     </w:lvl>
   </w:abstractNum>
   <w:num w:numId="1" w16cid:durableId="419327539">
-    <w:abstractNumId w:val="1"/>
+    <w:abstractNumId w:val="2"/>
   </w:num>
   <w:num w:numId="2" w16cid:durableId="483593578">
     <w:abstractNumId w:val="0"/>
+  </w:num>
+  <w:num w:numId="3" w16cid:durableId="828137154">
+    <w:abstractNumId w:val="1"/>
   </w:num>
 </w:numbering>
 </file>
@@ -1598,6 +2048,7 @@
   <w:style w:type="paragraph" w:default="1" w:styleId="Normal">
     <w:name w:val="Normal"/>
     <w:qFormat/>
+    <w:rsid w:val="009326FD"/>
   </w:style>
   <w:style w:type="paragraph" w:styleId="Heading1">
     <w:name w:val="heading 1"/>

</xml_diff>